<commit_message>
Update SIT225 Pass Task 1 Report with links to code and data files
</commit_message>
<xml_diff>
--- a/1P/SIT225 Pass Task 1 Report.docx
+++ b/1P/SIT225 Pass Task 1 Report.docx
@@ -685,6 +685,7 @@
       <w:r>
         <w:rPr>
           <w:rFonts w:ascii="Times New Roman" w:eastAsia="Times New Roman" w:hAnsi="Times New Roman" w:cs="Times New Roman"/>
+          <w:noProof/>
           <w:sz w:val="24"/>
           <w:szCs w:val="24"/>
         </w:rPr>
@@ -832,6 +833,7 @@
       <w:r>
         <w:rPr>
           <w:rFonts w:ascii="Times New Roman" w:hAnsi="Times New Roman" w:cs="Times New Roman"/>
+          <w:noProof/>
           <w:sz w:val="24"/>
           <w:szCs w:val="24"/>
         </w:rPr>
@@ -885,6 +887,7 @@
       <w:r>
         <w:rPr>
           <w:rFonts w:ascii="Times New Roman" w:hAnsi="Times New Roman" w:cs="Times New Roman"/>
+          <w:noProof/>
           <w:sz w:val="24"/>
           <w:szCs w:val="24"/>
         </w:rPr>
@@ -1962,6 +1965,12 @@
         </w:rPr>
         <w:t xml:space="preserve"> :</w:t>
       </w:r>
+      <w:r>
+        <w:rPr>
+          <w:rFonts w:ascii="Times New Roman" w:hAnsi="Times New Roman" w:cs="Times New Roman"/>
+        </w:rPr>
+        <w:t xml:space="preserve"> </w:t>
+      </w:r>
     </w:p>
     <w:p>
       <w:pPr>
@@ -1997,6 +2006,33 @@
         </w:rPr>
         <w:t>:</w:t>
       </w:r>
+      <w:r>
+        <w:rPr>
+          <w:rFonts w:ascii="Times New Roman" w:hAnsi="Times New Roman" w:cs="Times New Roman"/>
+        </w:rPr>
+        <w:t xml:space="preserve"> </w:t>
+      </w:r>
+      <w:r>
+        <w:rPr>
+          <w:rFonts w:ascii="Times New Roman" w:hAnsi="Times New Roman" w:cs="Times New Roman"/>
+        </w:rPr>
+        <w:br/>
+      </w:r>
+      <w:hyperlink r:id="rId10" w:history="1">
+        <w:r>
+          <w:rPr>
+            <w:rStyle w:val="Hyperlink"/>
+            <w:rFonts w:ascii="Times New Roman" w:hAnsi="Times New Roman" w:cs="Times New Roman"/>
+          </w:rPr>
+          <w:t>https://github.com/tuankhoi-296/sit-225/blob/main/1P/Code/p1.py</w:t>
+        </w:r>
+      </w:hyperlink>
+      <w:r>
+        <w:rPr>
+          <w:rFonts w:ascii="Times New Roman" w:hAnsi="Times New Roman" w:cs="Times New Roman"/>
+        </w:rPr>
+        <w:t xml:space="preserve"> </w:t>
+      </w:r>
     </w:p>
     <w:p>
       <w:pPr>
@@ -2024,7 +2060,6 @@
         <w:rPr>
           <w:rFonts w:ascii="Times New Roman" w:hAnsi="Times New Roman" w:cs="Times New Roman"/>
         </w:rPr>
-        <w:lastRenderedPageBreak/>
         <w:t xml:space="preserve">CSV data file: </w:t>
       </w:r>
     </w:p>
@@ -2038,9 +2073,8 @@
     </w:p>
     <w:p>
       <w:pPr>
-        <w:pStyle w:val="ListParagraph"/>
         <w:spacing w:after="60" w:line="264" w:lineRule="auto"/>
-        <w:ind w:left="720"/>
+        <w:ind w:left="360" w:right="-1"/>
         <w:rPr>
           <w:rFonts w:ascii="Times New Roman" w:hAnsi="Times New Roman" w:cs="Times New Roman"/>
         </w:rPr>
@@ -2057,12 +2091,38 @@
         </w:rPr>
         <w:t>:</w:t>
       </w:r>
-    </w:p>
-    <w:p>
-      <w:pPr>
-        <w:pStyle w:val="ListParagraph"/>
+      <w:r>
+        <w:rPr>
+          <w:rFonts w:ascii="Times New Roman" w:hAnsi="Times New Roman" w:cs="Times New Roman"/>
+        </w:rPr>
+        <w:t xml:space="preserve"> </w:t>
+      </w:r>
+      <w:r>
+        <w:rPr>
+          <w:rFonts w:ascii="Times New Roman" w:hAnsi="Times New Roman" w:cs="Times New Roman"/>
+        </w:rPr>
+        <w:br/>
+      </w:r>
+      <w:hyperlink r:id="rId11" w:history="1">
+        <w:r>
+          <w:rPr>
+            <w:rStyle w:val="Hyperlink"/>
+            <w:rFonts w:ascii="Times New Roman" w:hAnsi="Times New Roman" w:cs="Times New Roman"/>
+          </w:rPr>
+          <w:t>https://github.com/tuankhoi-296/sit-225/blob/main/1P/Code/1P_pir_with_groundtruth.csv</w:t>
+        </w:r>
+      </w:hyperlink>
+      <w:r>
+        <w:rPr>
+          <w:rFonts w:ascii="Times New Roman" w:hAnsi="Times New Roman" w:cs="Times New Roman"/>
+        </w:rPr>
+        <w:t xml:space="preserve"> </w:t>
+      </w:r>
+    </w:p>
+    <w:p>
+      <w:pPr>
         <w:spacing w:after="60" w:line="264" w:lineRule="auto"/>
-        <w:ind w:left="720"/>
+        <w:ind w:left="360"/>
         <w:rPr>
           <w:rFonts w:ascii="Times New Roman" w:hAnsi="Times New Roman" w:cs="Times New Roman"/>
         </w:rPr>
@@ -2073,6 +2133,27 @@
         </w:rPr>
         <w:t>The raw of PIR file</w:t>
       </w:r>
+      <w:r>
+        <w:rPr>
+          <w:rFonts w:ascii="Times New Roman" w:hAnsi="Times New Roman" w:cs="Times New Roman"/>
+        </w:rPr>
+        <w:t>:</w:t>
+      </w:r>
+      <w:r>
+        <w:rPr>
+          <w:rFonts w:ascii="Times New Roman" w:hAnsi="Times New Roman" w:cs="Times New Roman"/>
+        </w:rPr>
+        <w:br/>
+      </w:r>
+      <w:hyperlink r:id="rId12" w:history="1">
+        <w:r>
+          <w:rPr>
+            <w:rStyle w:val="Hyperlink"/>
+            <w:rFonts w:ascii="Times New Roman" w:hAnsi="Times New Roman" w:cs="Times New Roman"/>
+          </w:rPr>
+          <w:t>https://github.com/tuankhoi-296/sit-225/blob/main/1P/Code/pir_log.csv</w:t>
+        </w:r>
+      </w:hyperlink>
       <w:r>
         <w:rPr>
           <w:rFonts w:ascii="Times New Roman" w:hAnsi="Times New Roman" w:cs="Times New Roman"/>
@@ -2097,6 +2178,33 @@
           <w:rFonts w:ascii="Times New Roman" w:hAnsi="Times New Roman" w:cs="Times New Roman"/>
         </w:rPr>
         <w:t>:</w:t>
+      </w:r>
+      <w:r>
+        <w:rPr>
+          <w:rFonts w:ascii="Times New Roman" w:hAnsi="Times New Roman" w:cs="Times New Roman"/>
+        </w:rPr>
+        <w:t xml:space="preserve"> </w:t>
+      </w:r>
+      <w:r>
+        <w:rPr>
+          <w:rFonts w:ascii="Times New Roman" w:hAnsi="Times New Roman" w:cs="Times New Roman"/>
+        </w:rPr>
+        <w:br/>
+      </w:r>
+      <w:hyperlink r:id="rId13" w:history="1">
+        <w:r>
+          <w:rPr>
+            <w:rStyle w:val="Hyperlink"/>
+            <w:rFonts w:ascii="Times New Roman" w:hAnsi="Times New Roman" w:cs="Times New Roman"/>
+          </w:rPr>
+          <w:t>https://github.com/tuankhoi-296/sit-225/blob/main/1P/Code/dht22_log.csv</w:t>
+        </w:r>
+      </w:hyperlink>
+      <w:r>
+        <w:rPr>
+          <w:rFonts w:ascii="Times New Roman" w:hAnsi="Times New Roman" w:cs="Times New Roman"/>
+        </w:rPr>
+        <w:t xml:space="preserve"> </w:t>
       </w:r>
       <w:r>
         <w:rPr>
@@ -2144,6 +2252,7 @@
       <w:r>
         <w:rPr>
           <w:rFonts w:ascii="Times New Roman" w:hAnsi="Times New Roman" w:cs="Times New Roman"/>
+          <w:noProof/>
         </w:rPr>
         <w:drawing>
           <wp:inline distT="0" distB="0" distL="0" distR="0" wp14:anchorId="5534757E" wp14:editId="207D9AA2">
@@ -2161,7 +2270,7 @@
                     <pic:cNvPicPr/>
                   </pic:nvPicPr>
                   <pic:blipFill>
-                    <a:blip r:embed="rId10"/>
+                    <a:blip r:embed="rId14"/>
                     <a:stretch>
                       <a:fillRect/>
                     </a:stretch>
@@ -2344,7 +2453,7 @@
                     </pic:cNvPicPr>
                   </pic:nvPicPr>
                   <pic:blipFill>
-                    <a:blip r:embed="rId11"/>
+                    <a:blip r:embed="rId15"/>
                     <a:srcRect/>
                     <a:stretch>
                       <a:fillRect/>
@@ -2416,7 +2525,7 @@
                     </pic:cNvPicPr>
                   </pic:nvPicPr>
                   <pic:blipFill>
-                    <a:blip r:embed="rId12"/>
+                    <a:blip r:embed="rId16"/>
                     <a:srcRect/>
                     <a:stretch>
                       <a:fillRect/>
@@ -4197,8 +4306,8 @@
       </w:r>
     </w:p>
     <w:sectPr>
-      <w:headerReference w:type="default" r:id="rId13"/>
-      <w:footerReference w:type="default" r:id="rId14"/>
+      <w:headerReference w:type="default" r:id="rId17"/>
+      <w:footerReference w:type="default" r:id="rId18"/>
       <w:pgSz w:w="11906" w:h="16838"/>
       <w:pgMar w:top="1134" w:right="1134" w:bottom="1134" w:left="1134" w:header="708" w:footer="708" w:gutter="0"/>
       <w:cols w:space="720"/>
@@ -4669,7 +4778,7 @@
   <w:abstractNum w:abstractNumId="3" w15:restartNumberingAfterBreak="0">
     <w:nsid w:val="73E557D2"/>
     <w:multiLevelType w:val="hybridMultilevel"/>
-    <w:tmpl w:val="CD501E0C"/>
+    <w:tmpl w:val="7D3AB0B2"/>
     <w:lvl w:ilvl="0" w:tplc="2BB4EC84">
       <w:start w:val="1"/>
       <w:numFmt w:val="bullet"/>
@@ -4938,9 +5047,6 @@
   </w:abstractNum>
   <w:num w:numId="1">
     <w:abstractNumId w:val="3"/>
-    <w:lvlOverride w:ilvl="0">
-      <w:startOverride w:val="1"/>
-    </w:lvlOverride>
   </w:num>
   <w:num w:numId="2">
     <w:abstractNumId w:val="4"/>
@@ -4953,6 +5059,9 @@
   </w:num>
   <w:num w:numId="5">
     <w:abstractNumId w:val="2"/>
+  </w:num>
+  <w:num w:numId="6">
+    <w:abstractNumId w:val="3"/>
   </w:num>
 </w:numbering>
 </file>
@@ -5596,6 +5705,18 @@
     <w:uiPriority w:val="99"/>
     <w:rsid w:val="006B4622"/>
   </w:style>
+  <w:style w:type="character" w:styleId="UnresolvedMention">
+    <w:name w:val="Unresolved Mention"/>
+    <w:basedOn w:val="DefaultParagraphFont"/>
+    <w:uiPriority w:val="99"/>
+    <w:semiHidden/>
+    <w:unhideWhenUsed/>
+    <w:rsid w:val="00015731"/>
+    <w:rPr>
+      <w:color w:val="605E5C"/>
+      <w:shd w:val="clear" w:color="auto" w:fill="E1DFDD"/>
+    </w:rPr>
+  </w:style>
 </w:styles>
 </file>
 

</xml_diff>